<commit_message>
add function to specify image width
</commit_message>
<xml_diff>
--- a/TravelPlanning/Templates/旅遊行程套版_v2.docx
+++ b/TravelPlanning/Templates/旅遊行程套版_v2.docx
@@ -52,65 +52,33 @@
               <w:spacing w:after="260"/>
               <w:jc w:val="center"/>
             </w:pPr>
-            <w:r>
-              <w:fldChar w:fldCharType="begin"/>
-            </w:r>
-            <w:r>
-              <w:instrText xml:space="preserve"> MERGEFIELD TripName </w:instrText>
-            </w:r>
-            <w:r>
-              <w:fldChar w:fldCharType="separate"/>
-            </w:r>
-            <w:r>
-              <w:rPr>
-                <w:b/>
-                <w:bCs/>
-                <w:color w:val="FFFFFF"/>
-                <w:sz w:val="64"/>
-                <w:szCs w:val="64"/>
-              </w:rPr>
-              <w:t>«TripName»</w:t>
-            </w:r>
-            <w:r>
-              <w:rPr>
-                <w:b/>
-                <w:bCs/>
-                <w:color w:val="FFFFFF"/>
-                <w:sz w:val="64"/>
-                <w:szCs w:val="64"/>
-              </w:rPr>
-              <w:fldChar w:fldCharType="end"/>
-            </w:r>
+            <w:fldSimple w:instr=" MERGEFIELD TripName ">
+              <w:r>
+                <w:rPr>
+                  <w:b/>
+                  <w:bCs/>
+                  <w:color w:val="FFFFFF"/>
+                  <w:sz w:val="64"/>
+                  <w:szCs w:val="64"/>
+                </w:rPr>
+                <w:t>«TripName»</w:t>
+              </w:r>
+            </w:fldSimple>
           </w:p>
           <w:p>
             <w:pPr>
               <w:jc w:val="center"/>
             </w:pPr>
-            <w:r>
-              <w:fldChar w:fldCharType="begin"/>
-            </w:r>
-            <w:r>
-              <w:instrText xml:space="preserve"> MERGEFIELD StartDate </w:instrText>
-            </w:r>
-            <w:r>
-              <w:fldChar w:fldCharType="separate"/>
-            </w:r>
-            <w:r>
-              <w:rPr>
-                <w:color w:val="FFFFFF"/>
-                <w:sz w:val="24"/>
-                <w:szCs w:val="24"/>
-              </w:rPr>
-              <w:t>«StartDate»</w:t>
-            </w:r>
-            <w:r>
-              <w:rPr>
-                <w:color w:val="FFFFFF"/>
-                <w:sz w:val="24"/>
-                <w:szCs w:val="24"/>
-              </w:rPr>
-              <w:fldChar w:fldCharType="end"/>
-            </w:r>
+            <w:fldSimple w:instr=" MERGEFIELD StartDate ">
+              <w:r>
+                <w:rPr>
+                  <w:color w:val="FFFFFF"/>
+                  <w:sz w:val="24"/>
+                  <w:szCs w:val="24"/>
+                </w:rPr>
+                <w:t>«StartDate»</w:t>
+              </w:r>
+            </w:fldSimple>
             <w:r>
               <w:rPr>
                 <w:color w:val="C9973A"/>
@@ -119,31 +87,16 @@
               </w:rPr>
               <w:t xml:space="preserve">  —  </w:t>
             </w:r>
-            <w:r>
-              <w:fldChar w:fldCharType="begin"/>
-            </w:r>
-            <w:r>
-              <w:instrText xml:space="preserve"> MERGEFIELD EndDate </w:instrText>
-            </w:r>
-            <w:r>
-              <w:fldChar w:fldCharType="separate"/>
-            </w:r>
-            <w:r>
-              <w:rPr>
-                <w:color w:val="FFFFFF"/>
-                <w:sz w:val="24"/>
-                <w:szCs w:val="24"/>
-              </w:rPr>
-              <w:t>«EndDate»</w:t>
-            </w:r>
-            <w:r>
-              <w:rPr>
-                <w:color w:val="FFFFFF"/>
-                <w:sz w:val="24"/>
-                <w:szCs w:val="24"/>
-              </w:rPr>
-              <w:fldChar w:fldCharType="end"/>
-            </w:r>
+            <w:fldSimple w:instr=" MERGEFIELD EndDate ">
+              <w:r>
+                <w:rPr>
+                  <w:color w:val="FFFFFF"/>
+                  <w:sz w:val="24"/>
+                  <w:szCs w:val="24"/>
+                </w:rPr>
+                <w:t>«EndDate»</w:t>
+              </w:r>
+            </w:fldSimple>
           </w:p>
           <w:p>
             <w:pPr>
@@ -158,35 +111,18 @@
               </w:rPr>
               <w:t xml:space="preserve">共 </w:t>
             </w:r>
-            <w:r>
-              <w:fldChar w:fldCharType="begin"/>
-            </w:r>
-            <w:r>
-              <w:instrText xml:space="preserve"> MERGEFIELD TotalDays </w:instrText>
-            </w:r>
-            <w:r>
-              <w:fldChar w:fldCharType="separate"/>
-            </w:r>
-            <w:r>
-              <w:rPr>
-                <w:b/>
-                <w:bCs/>
-                <w:color w:val="C9973A"/>
-                <w:sz w:val="20"/>
-                <w:szCs w:val="20"/>
-              </w:rPr>
-              <w:t>«TotalDays»</w:t>
-            </w:r>
-            <w:r>
-              <w:rPr>
-                <w:b/>
-                <w:bCs/>
-                <w:color w:val="C9973A"/>
-                <w:sz w:val="20"/>
-                <w:szCs w:val="20"/>
-              </w:rPr>
-              <w:fldChar w:fldCharType="end"/>
-            </w:r>
+            <w:fldSimple w:instr=" MERGEFIELD TotalDays ">
+              <w:r>
+                <w:rPr>
+                  <w:b/>
+                  <w:bCs/>
+                  <w:color w:val="C9973A"/>
+                  <w:sz w:val="20"/>
+                  <w:szCs w:val="20"/>
+                </w:rPr>
+                <w:t>«TotalDays»</w:t>
+              </w:r>
+            </w:fldSimple>
             <w:r>
               <w:rPr>
                 <w:color w:val="CFCFCF"/>
@@ -204,16 +140,31 @@
       <w:bookmarkEnd w:id="0"/>
     </w:p>
     <w:p>
-      <w:fldSimple w:instr=" MERGEFIELD TableStart:Days ">
-        <w:r>
-          <w:rPr>
-            <w:color w:val="FFFFFF"/>
-            <w:sz w:val="2"/>
-            <w:szCs w:val="2"/>
-          </w:rPr>
-          <w:t>«TableStart:Days»</w:t>
-        </w:r>
-      </w:fldSimple>
+      <w:r>
+        <w:fldChar w:fldCharType="begin"/>
+      </w:r>
+      <w:r>
+        <w:instrText xml:space="preserve"> MERGEFIELD TableStart:Days </w:instrText>
+      </w:r>
+      <w:r>
+        <w:fldChar w:fldCharType="separate"/>
+      </w:r>
+      <w:r>
+        <w:rPr>
+          <w:color w:val="FFFFFF"/>
+          <w:sz w:val="2"/>
+          <w:szCs w:val="2"/>
+        </w:rPr>
+        <w:t>«TableStart:Days»</w:t>
+      </w:r>
+      <w:r>
+        <w:rPr>
+          <w:color w:val="FFFFFF"/>
+          <w:sz w:val="2"/>
+          <w:szCs w:val="2"/>
+        </w:rPr>
+        <w:fldChar w:fldCharType="end"/>
+      </w:r>
     </w:p>
     <w:tbl>
       <w:tblPr>
@@ -245,35 +196,18 @@
             <w:vAlign w:val="center"/>
           </w:tcPr>
           <w:p>
-            <w:r>
-              <w:fldChar w:fldCharType="begin"/>
-            </w:r>
-            <w:r>
-              <w:instrText xml:space="preserve"> MERGEFIELD DayIndex </w:instrText>
-            </w:r>
-            <w:r>
-              <w:fldChar w:fldCharType="separate"/>
-            </w:r>
-            <w:r>
-              <w:rPr>
-                <w:b/>
-                <w:bCs/>
-                <w:color w:val="C9973A"/>
-                <w:sz w:val="30"/>
-                <w:szCs w:val="30"/>
-              </w:rPr>
-              <w:t>«DayIndex»</w:t>
-            </w:r>
-            <w:r>
-              <w:rPr>
-                <w:b/>
-                <w:bCs/>
-                <w:color w:val="C9973A"/>
-                <w:sz w:val="30"/>
-                <w:szCs w:val="30"/>
-              </w:rPr>
-              <w:fldChar w:fldCharType="end"/>
-            </w:r>
+            <w:fldSimple w:instr=" MERGEFIELD DayIndex ">
+              <w:r>
+                <w:rPr>
+                  <w:b/>
+                  <w:bCs/>
+                  <w:color w:val="C9973A"/>
+                  <w:sz w:val="30"/>
+                  <w:szCs w:val="30"/>
+                </w:rPr>
+                <w:t>«DayIndex»</w:t>
+              </w:r>
+            </w:fldSimple>
             <w:r>
               <w:t xml:space="preserve">  </w:t>
             </w:r>
@@ -290,63 +224,31 @@
             <w:pPr>
               <w:spacing w:before="40"/>
             </w:pPr>
-            <w:r>
-              <w:fldChar w:fldCharType="begin"/>
-            </w:r>
-            <w:r>
-              <w:instrText xml:space="preserve"> MERGEFIELD DayDate </w:instrText>
-            </w:r>
-            <w:r>
-              <w:fldChar w:fldCharType="separate"/>
-            </w:r>
-            <w:r>
-              <w:rPr>
-                <w:b/>
-                <w:bCs/>
-                <w:color w:val="FFFFFF"/>
-                <w:sz w:val="20"/>
-                <w:szCs w:val="20"/>
-              </w:rPr>
-              <w:t>«DayDate»</w:t>
-            </w:r>
-            <w:r>
-              <w:rPr>
-                <w:b/>
-                <w:bCs/>
-                <w:color w:val="FFFFFF"/>
-                <w:sz w:val="20"/>
-                <w:szCs w:val="20"/>
-              </w:rPr>
-              <w:fldChar w:fldCharType="end"/>
-            </w:r>
+            <w:fldSimple w:instr=" MERGEFIELD DayDate ">
+              <w:r>
+                <w:rPr>
+                  <w:b/>
+                  <w:bCs/>
+                  <w:color w:val="FFFFFF"/>
+                  <w:sz w:val="20"/>
+                  <w:szCs w:val="20"/>
+                </w:rPr>
+                <w:t>«DayDate»</w:t>
+              </w:r>
+            </w:fldSimple>
             <w:r>
               <w:t xml:space="preserve">　</w:t>
             </w:r>
-            <w:r>
-              <w:fldChar w:fldCharType="begin"/>
-            </w:r>
-            <w:r>
-              <w:instrText xml:space="preserve"> MERGEFIELD DayWeekday </w:instrText>
-            </w:r>
-            <w:r>
-              <w:fldChar w:fldCharType="separate"/>
-            </w:r>
-            <w:r>
-              <w:rPr>
-                <w:color w:val="C7D6DC"/>
-                <w:sz w:val="18"/>
-                <w:szCs w:val="18"/>
-              </w:rPr>
-              <w:t>«DayWeekday»</w:t>
-            </w:r>
-            <w:r>
-              <w:rPr>
-                <w:color w:val="C7D6DC"/>
-                <w:sz w:val="18"/>
-                <w:szCs w:val="18"/>
-              </w:rPr>
-              <w:fldChar w:fldCharType="end"/>
-            </w:r>
+            <w:fldSimple w:instr=" MERGEFIELD DayWeekday ">
+              <w:r>
+                <w:rPr>
+                  <w:color w:val="C7D6DC"/>
+                  <w:sz w:val="18"/>
+                  <w:szCs w:val="18"/>
+                </w:rPr>
+                <w:t>«DayWeekday»</w:t>
+              </w:r>
+            </w:fldSimple>
           </w:p>
         </w:tc>
         <w:tc>
@@ -379,35 +281,18 @@
               <w:spacing w:before="40"/>
               <w:jc w:val="right"/>
             </w:pPr>
-            <w:r>
-              <w:fldChar w:fldCharType="begin"/>
-            </w:r>
-            <w:r>
-              <w:instrText xml:space="preserve"> MERGEFIELD DepartureTime </w:instrText>
-            </w:r>
-            <w:r>
-              <w:fldChar w:fldCharType="separate"/>
-            </w:r>
-            <w:r>
-              <w:rPr>
-                <w:b/>
-                <w:bCs/>
-                <w:color w:val="C9973A"/>
-                <w:sz w:val="24"/>
-                <w:szCs w:val="24"/>
-              </w:rPr>
-              <w:t>«DepartureTime»</w:t>
-            </w:r>
-            <w:r>
-              <w:rPr>
-                <w:b/>
-                <w:bCs/>
-                <w:color w:val="C9973A"/>
-                <w:sz w:val="24"/>
-                <w:szCs w:val="24"/>
-              </w:rPr>
-              <w:fldChar w:fldCharType="end"/>
-            </w:r>
+            <w:fldSimple w:instr=" MERGEFIELD DepartureTime ">
+              <w:r>
+                <w:rPr>
+                  <w:b/>
+                  <w:bCs/>
+                  <w:color w:val="C9973A"/>
+                  <w:sz w:val="24"/>
+                  <w:szCs w:val="24"/>
+                </w:rPr>
+                <w:t>«DepartureTime»</w:t>
+              </w:r>
+            </w:fldSimple>
           </w:p>
         </w:tc>
       </w:tr>
@@ -468,50 +353,48 @@
                   </w:tcMar>
                 </w:tcPr>
                 <w:p>
-                  <w:fldSimple w:instr=" MERGEFIELD TableStart:Stops ">
-                    <w:r>
-                      <w:rPr>
-                        <w:color w:val="FFFFFF"/>
-                        <w:sz w:val="2"/>
-                        <w:szCs w:val="2"/>
-                      </w:rPr>
-                      <w:t>«TableStart:Stops»</w:t>
-                    </w:r>
-                  </w:fldSimple>
-                </w:p>
-                <w:p>
-                  <w:pPr>
-                    <w:jc w:val="right"/>
-                  </w:pPr>
                   <w:r>
                     <w:fldChar w:fldCharType="begin"/>
                   </w:r>
                   <w:r>
-                    <w:instrText xml:space="preserve"> MERGEFIELD StopTime </w:instrText>
+                    <w:instrText xml:space="preserve"> MERGEFIELD TableStart:Stops </w:instrText>
                   </w:r>
                   <w:r>
                     <w:fldChar w:fldCharType="separate"/>
                   </w:r>
                   <w:r>
                     <w:rPr>
-                      <w:b/>
-                      <w:bCs/>
-                      <w:color w:val="1B3A4B"/>
-                      <w:sz w:val="20"/>
-                      <w:szCs w:val="20"/>
+                      <w:color w:val="FFFFFF"/>
+                      <w:sz w:val="2"/>
+                      <w:szCs w:val="2"/>
                     </w:rPr>
-                    <w:t>«StopTime»</w:t>
+                    <w:t>«TableStart:Stops»</w:t>
                   </w:r>
                   <w:r>
                     <w:rPr>
-                      <w:b/>
-                      <w:bCs/>
-                      <w:color w:val="1B3A4B"/>
-                      <w:sz w:val="20"/>
-                      <w:szCs w:val="20"/>
+                      <w:color w:val="FFFFFF"/>
+                      <w:sz w:val="2"/>
+                      <w:szCs w:val="2"/>
                     </w:rPr>
                     <w:fldChar w:fldCharType="end"/>
                   </w:r>
+                </w:p>
+                <w:p>
+                  <w:pPr>
+                    <w:jc w:val="right"/>
+                  </w:pPr>
+                  <w:fldSimple w:instr=" MERGEFIELD StopTime ">
+                    <w:r>
+                      <w:rPr>
+                        <w:b/>
+                        <w:bCs/>
+                        <w:color w:val="1B3A4B"/>
+                        <w:sz w:val="20"/>
+                        <w:szCs w:val="20"/>
+                      </w:rPr>
+                      <w:t>«StopTime»</w:t>
+                    </w:r>
+                  </w:fldSimple>
                 </w:p>
               </w:tc>
               <w:tc>
@@ -551,35 +434,18 @@
                   </w:tcMar>
                 </w:tcPr>
                 <w:p>
-                  <w:r>
-                    <w:fldChar w:fldCharType="begin"/>
-                  </w:r>
-                  <w:r>
-                    <w:instrText xml:space="preserve"> MERGEFIELD StopName </w:instrText>
-                  </w:r>
-                  <w:r>
-                    <w:fldChar w:fldCharType="separate"/>
-                  </w:r>
-                  <w:r>
-                    <w:rPr>
-                      <w:b/>
-                      <w:bCs/>
-                      <w:color w:val="222222"/>
-                      <w:sz w:val="22"/>
-                      <w:szCs w:val="22"/>
-                    </w:rPr>
-                    <w:t>«StopName»</w:t>
-                  </w:r>
-                  <w:r>
-                    <w:rPr>
-                      <w:b/>
-                      <w:bCs/>
-                      <w:color w:val="222222"/>
-                      <w:sz w:val="22"/>
-                      <w:szCs w:val="22"/>
-                    </w:rPr>
-                    <w:fldChar w:fldCharType="end"/>
-                  </w:r>
+                  <w:fldSimple w:instr=" MERGEFIELD StopName ">
+                    <w:r>
+                      <w:rPr>
+                        <w:b/>
+                        <w:bCs/>
+                        <w:color w:val="222222"/>
+                        <w:sz w:val="22"/>
+                        <w:szCs w:val="22"/>
+                      </w:rPr>
+                      <w:t>«StopName»</w:t>
+                    </w:r>
+                  </w:fldSimple>
                 </w:p>
                 <w:p>
                   <w:pPr>
@@ -593,49 +459,16 @@
                     </w:rPr>
                     <w:t xml:space="preserve">停留 </w:t>
                   </w:r>
-                  <w:r>
-                    <w:fldChar w:fldCharType="begin"/>
-                  </w:r>
-                  <w:r>
-                    <w:instrText xml:space="preserve"> MERGEFIELD StopDuration </w:instrText>
-                  </w:r>
-                  <w:r>
-                    <w:fldChar w:fldCharType="separate"/>
-                  </w:r>
-                  <w:r>
-                    <w:rPr>
-                      <w:color w:val="8A8A8A"/>
-                      <w:sz w:val="18"/>
-                      <w:szCs w:val="18"/>
-                    </w:rPr>
-                    <w:t>«</w:t>
-                  </w:r>
-                  <w:proofErr w:type="spellStart"/>
-                  <w:r>
-                    <w:rPr>
-                      <w:color w:val="8A8A8A"/>
-                      <w:sz w:val="18"/>
-                      <w:szCs w:val="18"/>
-                    </w:rPr>
-                    <w:t>StopDuration</w:t>
-                  </w:r>
-                  <w:proofErr w:type="spellEnd"/>
-                  <w:r>
-                    <w:rPr>
-                      <w:color w:val="8A8A8A"/>
-                      <w:sz w:val="18"/>
-                      <w:szCs w:val="18"/>
-                    </w:rPr>
-                    <w:t>»</w:t>
-                  </w:r>
-                  <w:r>
-                    <w:rPr>
-                      <w:color w:val="8A8A8A"/>
-                      <w:sz w:val="18"/>
-                      <w:szCs w:val="18"/>
-                    </w:rPr>
-                    <w:fldChar w:fldCharType="end"/>
-                  </w:r>
+                  <w:fldSimple w:instr=" MERGEFIELD StopDuration ">
+                    <w:r>
+                      <w:rPr>
+                        <w:color w:val="8A8A8A"/>
+                        <w:sz w:val="18"/>
+                        <w:szCs w:val="18"/>
+                      </w:rPr>
+                      <w:t>«StopDuration»</w:t>
+                    </w:r>
+                  </w:fldSimple>
                   <w:r>
                     <w:rPr>
                       <w:rFonts w:hint="eastAsia"/>
@@ -660,57 +493,18 @@
                     </w:rPr>
                     <w:t xml:space="preserve">移動時間　</w:t>
                   </w:r>
-                  <w:r>
-                    <w:fldChar w:fldCharType="begin"/>
-                  </w:r>
-                  <w:r>
-                    <w:instrText xml:space="preserve"> MERGEFIELD TravelTimeToNext </w:instrText>
-                  </w:r>
-                  <w:r>
-                    <w:fldChar w:fldCharType="separate"/>
-                  </w:r>
-                  <w:r>
-                    <w:rPr>
-                      <w:i/>
-                      <w:iCs/>
-                      <w:color w:val="B7B7B7"/>
-                      <w:sz w:val="16"/>
-                      <w:szCs w:val="16"/>
-                    </w:rPr>
-                    <w:t>«</w:t>
-                  </w:r>
-                  <w:proofErr w:type="spellStart"/>
-                  <w:r>
-                    <w:rPr>
-                      <w:i/>
-                      <w:iCs/>
-                      <w:color w:val="B7B7B7"/>
-                      <w:sz w:val="16"/>
-                      <w:szCs w:val="16"/>
-                    </w:rPr>
-                    <w:t>TravelTimeToNext</w:t>
-                  </w:r>
-                  <w:proofErr w:type="spellEnd"/>
-                  <w:r>
-                    <w:rPr>
-                      <w:i/>
-                      <w:iCs/>
-                      <w:color w:val="B7B7B7"/>
-                      <w:sz w:val="16"/>
-                      <w:szCs w:val="16"/>
-                    </w:rPr>
-                    <w:t>»</w:t>
-                  </w:r>
-                  <w:r>
-                    <w:rPr>
-                      <w:i/>
-                      <w:iCs/>
-                      <w:color w:val="B7B7B7"/>
-                      <w:sz w:val="16"/>
-                      <w:szCs w:val="16"/>
-                    </w:rPr>
-                    <w:fldChar w:fldCharType="end"/>
-                  </w:r>
+                  <w:fldSimple w:instr=" MERGEFIELD TravelTimeToNext ">
+                    <w:r>
+                      <w:rPr>
+                        <w:i/>
+                        <w:iCs/>
+                        <w:color w:val="B7B7B7"/>
+                        <w:sz w:val="16"/>
+                        <w:szCs w:val="16"/>
+                      </w:rPr>
+                      <w:t>«TravelTimeToNext»</w:t>
+                    </w:r>
+                  </w:fldSimple>
                   <w:r>
                     <w:rPr>
                       <w:rFonts w:hint="eastAsia"/>
@@ -722,53 +516,18 @@
                     </w:rPr>
                     <w:t xml:space="preserve"> 分</w:t>
                   </w:r>
-                  <w:bookmarkStart w:id="1" w:name="_GoBack"/>
-                  <w:bookmarkEnd w:id="1"/>
                 </w:p>
                 <w:p>
-                  <w:r>
-                    <w:fldChar w:fldCharType="begin"/>
-                  </w:r>
-                  <w:r>
-                    <w:instrText xml:space="preserve"> MERGEFIELD TableEnd:Stops </w:instrText>
-                  </w:r>
-                  <w:r>
-                    <w:fldChar w:fldCharType="separate"/>
-                  </w:r>
-                  <w:r>
-                    <w:rPr>
-                      <w:color w:val="FFFFFF"/>
-                      <w:sz w:val="2"/>
-                      <w:szCs w:val="2"/>
-                    </w:rPr>
-                    <w:t>«</w:t>
-                  </w:r>
-                  <w:proofErr w:type="gramStart"/>
-                  <w:r>
-                    <w:rPr>
-                      <w:color w:val="FFFFFF"/>
-                      <w:sz w:val="2"/>
-                      <w:szCs w:val="2"/>
-                    </w:rPr>
-                    <w:t>TableEnd:Stops</w:t>
-                  </w:r>
-                  <w:proofErr w:type="gramEnd"/>
-                  <w:r>
-                    <w:rPr>
-                      <w:color w:val="FFFFFF"/>
-                      <w:sz w:val="2"/>
-                      <w:szCs w:val="2"/>
-                    </w:rPr>
-                    <w:t>»</w:t>
-                  </w:r>
-                  <w:r>
-                    <w:rPr>
-                      <w:color w:val="FFFFFF"/>
-                      <w:sz w:val="2"/>
-                      <w:szCs w:val="2"/>
-                    </w:rPr>
-                    <w:fldChar w:fldCharType="end"/>
-                  </w:r>
+                  <w:fldSimple w:instr=" MERGEFIELD TableEnd:Stops ">
+                    <w:r>
+                      <w:rPr>
+                        <w:color w:val="FFFFFF"/>
+                        <w:sz w:val="2"/>
+                        <w:szCs w:val="2"/>
+                      </w:rPr>
+                      <w:t>«TableEnd:Stops»</w:t>
+                    </w:r>
+                  </w:fldSimple>
                 </w:p>
               </w:tc>
             </w:tr>
@@ -783,91 +542,39 @@
               <w:left w:w="0" w:type="dxa"/>
             </w:tcMar>
           </w:tcPr>
-          <w:tbl>
-            <w:tblPr>
-              <w:tblW w:w="5000" w:type="pct"/>
-              <w:tblCellMar>
-                <w:left w:w="10" w:type="dxa"/>
-                <w:right w:w="10" w:type="dxa"/>
-              </w:tblCellMar>
-              <w:tblLook w:val="0000" w:firstRow="0" w:lastRow="0" w:firstColumn="0" w:lastColumn="0" w:noHBand="0" w:noVBand="0"/>
-            </w:tblPr>
-            <w:tblGrid>
-              <w:gridCol w:w="3820"/>
-            </w:tblGrid>
-            <w:tr>
-              <w:tc>
-                <w:tcPr>
-                  <w:tcW w:w="0" w:type="auto"/>
-                  <w:tcBorders>
-                    <w:top w:val="single" w:sz="4" w:space="0" w:color="D9D2C2"/>
-                    <w:left w:val="single" w:sz="4" w:space="0" w:color="D9D2C2"/>
-                    <w:bottom w:val="single" w:sz="4" w:space="0" w:color="D9D2C2"/>
-                    <w:right w:val="single" w:sz="4" w:space="0" w:color="D9D2C2"/>
-                  </w:tcBorders>
-                  <w:shd w:val="clear" w:color="auto" w:fill="F7F4EE"/>
-                  <w:tcMar>
-                    <w:top w:w="100" w:type="dxa"/>
-                    <w:left w:w="100" w:type="dxa"/>
-                    <w:bottom w:w="100" w:type="dxa"/>
-                    <w:right w:w="100" w:type="dxa"/>
-                  </w:tcMar>
-                  <w:vAlign w:val="center"/>
-                </w:tcPr>
-                <w:p>
-                  <w:pPr>
-                    <w:spacing w:before="1800"/>
-                    <w:jc w:val="center"/>
-                  </w:pPr>
-                  <w:r>
-                    <w:rPr>
-                      <w:color w:val="8A8A8A"/>
-                      <w:spacing w:val="30"/>
-                      <w:sz w:val="18"/>
-                      <w:szCs w:val="18"/>
-                    </w:rPr>
-                    <w:t>路　線　地　圖</w:t>
-                  </w:r>
-                </w:p>
-                <w:p>
-                  <w:pPr>
-                    <w:spacing w:before="200" w:after="1800"/>
-                    <w:jc w:val="center"/>
-                  </w:pPr>
-                  <w:r>
-                    <w:fldChar w:fldCharType="begin"/>
-                  </w:r>
-                  <w:r>
-                    <w:instrText xml:space="preserve"> MERGEFIELD Image:DayRouteMap </w:instrText>
-                  </w:r>
-                  <w:r>
-                    <w:fldChar w:fldCharType="separate"/>
-                  </w:r>
-                  <w:r>
-                    <w:rPr>
-                      <w:i/>
-                      <w:iCs/>
-                      <w:color w:val="B5B5B5"/>
-                      <w:sz w:val="16"/>
-                      <w:szCs w:val="16"/>
-                    </w:rPr>
-                    <w:t>«Image:DayRouteMap»</w:t>
-                  </w:r>
-                  <w:r>
-                    <w:rPr>
-                      <w:i/>
-                      <w:iCs/>
-                      <w:color w:val="B5B5B5"/>
-                      <w:sz w:val="16"/>
-                      <w:szCs w:val="16"/>
-                    </w:rPr>
-                    <w:fldChar w:fldCharType="end"/>
-                  </w:r>
-                </w:p>
-              </w:tc>
-            </w:tr>
-          </w:tbl>
-          <w:p/>
+          <w:p>
+            <w:r>
+              <w:fldChar w:fldCharType="begin"/>
+            </w:r>
+            <w:r>
+              <w:instrText xml:space="preserve"> MERGEFIELD Image:DayRouteMap </w:instrText>
+            </w:r>
+            <w:r>
+              <w:fldChar w:fldCharType="separate"/>
+            </w:r>
+            <w:r>
+              <w:rPr>
+                <w:i/>
+                <w:iCs/>
+                <w:color w:val="B5B5B5"/>
+                <w:sz w:val="16"/>
+                <w:szCs w:val="16"/>
+              </w:rPr>
+              <w:t>«Image:DayRouteMap»</w:t>
+            </w:r>
+            <w:r>
+              <w:rPr>
+                <w:i/>
+                <w:iCs/>
+                <w:color w:val="B5B5B5"/>
+                <w:sz w:val="16"/>
+                <w:szCs w:val="16"/>
+              </w:rPr>
+              <w:fldChar w:fldCharType="end"/>
+            </w:r>
+            <w:bookmarkStart w:id="1" w:name="_GoBack"/>
+            <w:bookmarkEnd w:id="1"/>
+          </w:p>
         </w:tc>
       </w:tr>
     </w:tbl>
@@ -880,31 +587,16 @@
       </w:pPr>
     </w:p>
     <w:p>
-      <w:r>
-        <w:fldChar w:fldCharType="begin"/>
-      </w:r>
-      <w:r>
-        <w:instrText xml:space="preserve"> MERGEFIELD TableEnd:Days </w:instrText>
-      </w:r>
-      <w:r>
-        <w:fldChar w:fldCharType="separate"/>
-      </w:r>
-      <w:r>
-        <w:rPr>
-          <w:color w:val="FFFFFF"/>
-          <w:sz w:val="2"/>
-          <w:szCs w:val="2"/>
-        </w:rPr>
-        <w:t>«TableEnd:Days»</w:t>
-      </w:r>
-      <w:r>
-        <w:rPr>
-          <w:color w:val="FFFFFF"/>
-          <w:sz w:val="2"/>
-          <w:szCs w:val="2"/>
-        </w:rPr>
-        <w:fldChar w:fldCharType="end"/>
-      </w:r>
+      <w:fldSimple w:instr=" MERGEFIELD TableEnd:Days ">
+        <w:r>
+          <w:rPr>
+            <w:color w:val="FFFFFF"/>
+            <w:sz w:val="2"/>
+            <w:szCs w:val="2"/>
+          </w:rPr>
+          <w:t>«TableEnd:Days»</w:t>
+        </w:r>
+      </w:fldSimple>
     </w:p>
     <w:p>
       <w:r>

</xml_diff>

<commit_message>
fix googlemap marker position issue
</commit_message>
<xml_diff>
--- a/TravelPlanning/Templates/旅遊行程套版_v2.docx
+++ b/TravelPlanning/Templates/旅遊行程套版_v2.docx
@@ -52,33 +52,65 @@
               <w:spacing w:after="260"/>
               <w:jc w:val="center"/>
             </w:pPr>
-            <w:fldSimple w:instr=" MERGEFIELD TripName ">
-              <w:r>
-                <w:rPr>
-                  <w:b/>
-                  <w:bCs/>
-                  <w:color w:val="FFFFFF"/>
-                  <w:sz w:val="64"/>
-                  <w:szCs w:val="64"/>
-                </w:rPr>
-                <w:t>«TripName»</w:t>
-              </w:r>
-            </w:fldSimple>
+            <w:r>
+              <w:fldChar w:fldCharType="begin"/>
+            </w:r>
+            <w:r>
+              <w:instrText xml:space="preserve"> MERGEFIELD TripName </w:instrText>
+            </w:r>
+            <w:r>
+              <w:fldChar w:fldCharType="separate"/>
+            </w:r>
+            <w:r>
+              <w:rPr>
+                <w:b/>
+                <w:bCs/>
+                <w:color w:val="FFFFFF"/>
+                <w:sz w:val="64"/>
+                <w:szCs w:val="64"/>
+              </w:rPr>
+              <w:t>«TripName»</w:t>
+            </w:r>
+            <w:r>
+              <w:rPr>
+                <w:b/>
+                <w:bCs/>
+                <w:color w:val="FFFFFF"/>
+                <w:sz w:val="64"/>
+                <w:szCs w:val="64"/>
+              </w:rPr>
+              <w:fldChar w:fldCharType="end"/>
+            </w:r>
           </w:p>
           <w:p>
             <w:pPr>
               <w:jc w:val="center"/>
             </w:pPr>
-            <w:fldSimple w:instr=" MERGEFIELD StartDate ">
-              <w:r>
-                <w:rPr>
-                  <w:color w:val="FFFFFF"/>
-                  <w:sz w:val="24"/>
-                  <w:szCs w:val="24"/>
-                </w:rPr>
-                <w:t>«StartDate»</w:t>
-              </w:r>
-            </w:fldSimple>
+            <w:r>
+              <w:fldChar w:fldCharType="begin"/>
+            </w:r>
+            <w:r>
+              <w:instrText xml:space="preserve"> MERGEFIELD StartDate </w:instrText>
+            </w:r>
+            <w:r>
+              <w:fldChar w:fldCharType="separate"/>
+            </w:r>
+            <w:r>
+              <w:rPr>
+                <w:color w:val="FFFFFF"/>
+                <w:sz w:val="24"/>
+                <w:szCs w:val="24"/>
+              </w:rPr>
+              <w:t>«StartDate»</w:t>
+            </w:r>
+            <w:r>
+              <w:rPr>
+                <w:color w:val="FFFFFF"/>
+                <w:sz w:val="24"/>
+                <w:szCs w:val="24"/>
+              </w:rPr>
+              <w:fldChar w:fldCharType="end"/>
+            </w:r>
             <w:r>
               <w:rPr>
                 <w:color w:val="C9973A"/>
@@ -87,16 +119,31 @@
               </w:rPr>
               <w:t xml:space="preserve">  —  </w:t>
             </w:r>
-            <w:fldSimple w:instr=" MERGEFIELD EndDate ">
-              <w:r>
-                <w:rPr>
-                  <w:color w:val="FFFFFF"/>
-                  <w:sz w:val="24"/>
-                  <w:szCs w:val="24"/>
-                </w:rPr>
-                <w:t>«EndDate»</w:t>
-              </w:r>
-            </w:fldSimple>
+            <w:r>
+              <w:fldChar w:fldCharType="begin"/>
+            </w:r>
+            <w:r>
+              <w:instrText xml:space="preserve"> MERGEFIELD EndDate </w:instrText>
+            </w:r>
+            <w:r>
+              <w:fldChar w:fldCharType="separate"/>
+            </w:r>
+            <w:r>
+              <w:rPr>
+                <w:color w:val="FFFFFF"/>
+                <w:sz w:val="24"/>
+                <w:szCs w:val="24"/>
+              </w:rPr>
+              <w:t>«EndDate»</w:t>
+            </w:r>
+            <w:r>
+              <w:rPr>
+                <w:color w:val="FFFFFF"/>
+                <w:sz w:val="24"/>
+                <w:szCs w:val="24"/>
+              </w:rPr>
+              <w:fldChar w:fldCharType="end"/>
+            </w:r>
           </w:p>
           <w:p>
             <w:pPr>
@@ -111,18 +158,35 @@
               </w:rPr>
               <w:t xml:space="preserve">共 </w:t>
             </w:r>
-            <w:fldSimple w:instr=" MERGEFIELD TotalDays ">
-              <w:r>
-                <w:rPr>
-                  <w:b/>
-                  <w:bCs/>
-                  <w:color w:val="C9973A"/>
-                  <w:sz w:val="20"/>
-                  <w:szCs w:val="20"/>
-                </w:rPr>
-                <w:t>«TotalDays»</w:t>
-              </w:r>
-            </w:fldSimple>
+            <w:r>
+              <w:fldChar w:fldCharType="begin"/>
+            </w:r>
+            <w:r>
+              <w:instrText xml:space="preserve"> MERGEFIELD TotalDays </w:instrText>
+            </w:r>
+            <w:r>
+              <w:fldChar w:fldCharType="separate"/>
+            </w:r>
+            <w:r>
+              <w:rPr>
+                <w:b/>
+                <w:bCs/>
+                <w:color w:val="C9973A"/>
+                <w:sz w:val="20"/>
+                <w:szCs w:val="20"/>
+              </w:rPr>
+              <w:t>«TotalDays»</w:t>
+            </w:r>
+            <w:r>
+              <w:rPr>
+                <w:b/>
+                <w:bCs/>
+                <w:color w:val="C9973A"/>
+                <w:sz w:val="20"/>
+                <w:szCs w:val="20"/>
+              </w:rPr>
+              <w:fldChar w:fldCharType="end"/>
+            </w:r>
             <w:r>
               <w:rPr>
                 <w:color w:val="CFCFCF"/>
@@ -140,31 +204,16 @@
       <w:bookmarkEnd w:id="0"/>
     </w:p>
     <w:p>
-      <w:r>
-        <w:fldChar w:fldCharType="begin"/>
-      </w:r>
-      <w:r>
-        <w:instrText xml:space="preserve"> MERGEFIELD TableStart:Days </w:instrText>
-      </w:r>
-      <w:r>
-        <w:fldChar w:fldCharType="separate"/>
-      </w:r>
-      <w:r>
-        <w:rPr>
-          <w:color w:val="FFFFFF"/>
-          <w:sz w:val="2"/>
-          <w:szCs w:val="2"/>
-        </w:rPr>
-        <w:t>«TableStart:Days»</w:t>
-      </w:r>
-      <w:r>
-        <w:rPr>
-          <w:color w:val="FFFFFF"/>
-          <w:sz w:val="2"/>
-          <w:szCs w:val="2"/>
-        </w:rPr>
-        <w:fldChar w:fldCharType="end"/>
-      </w:r>
+      <w:fldSimple w:instr=" MERGEFIELD TableStart:Days ">
+        <w:r>
+          <w:rPr>
+            <w:color w:val="FFFFFF"/>
+            <w:sz w:val="2"/>
+            <w:szCs w:val="2"/>
+          </w:rPr>
+          <w:t>«TableStart:Days»</w:t>
+        </w:r>
+      </w:fldSimple>
     </w:p>
     <w:tbl>
       <w:tblPr>
@@ -196,18 +245,35 @@
             <w:vAlign w:val="center"/>
           </w:tcPr>
           <w:p>
-            <w:fldSimple w:instr=" MERGEFIELD DayIndex ">
-              <w:r>
-                <w:rPr>
-                  <w:b/>
-                  <w:bCs/>
-                  <w:color w:val="C9973A"/>
-                  <w:sz w:val="30"/>
-                  <w:szCs w:val="30"/>
-                </w:rPr>
-                <w:t>«DayIndex»</w:t>
-              </w:r>
-            </w:fldSimple>
+            <w:r>
+              <w:fldChar w:fldCharType="begin"/>
+            </w:r>
+            <w:r>
+              <w:instrText xml:space="preserve"> MERGEFIELD DayIndex </w:instrText>
+            </w:r>
+            <w:r>
+              <w:fldChar w:fldCharType="separate"/>
+            </w:r>
+            <w:r>
+              <w:rPr>
+                <w:b/>
+                <w:bCs/>
+                <w:color w:val="C9973A"/>
+                <w:sz w:val="30"/>
+                <w:szCs w:val="30"/>
+              </w:rPr>
+              <w:t>«DayIndex»</w:t>
+            </w:r>
+            <w:r>
+              <w:rPr>
+                <w:b/>
+                <w:bCs/>
+                <w:color w:val="C9973A"/>
+                <w:sz w:val="30"/>
+                <w:szCs w:val="30"/>
+              </w:rPr>
+              <w:fldChar w:fldCharType="end"/>
+            </w:r>
             <w:r>
               <w:t xml:space="preserve">  </w:t>
             </w:r>
@@ -224,31 +290,63 @@
             <w:pPr>
               <w:spacing w:before="40"/>
             </w:pPr>
-            <w:fldSimple w:instr=" MERGEFIELD DayDate ">
-              <w:r>
-                <w:rPr>
-                  <w:b/>
-                  <w:bCs/>
-                  <w:color w:val="FFFFFF"/>
-                  <w:sz w:val="20"/>
-                  <w:szCs w:val="20"/>
-                </w:rPr>
-                <w:t>«DayDate»</w:t>
-              </w:r>
-            </w:fldSimple>
+            <w:r>
+              <w:fldChar w:fldCharType="begin"/>
+            </w:r>
+            <w:r>
+              <w:instrText xml:space="preserve"> MERGEFIELD DayDate </w:instrText>
+            </w:r>
+            <w:r>
+              <w:fldChar w:fldCharType="separate"/>
+            </w:r>
+            <w:r>
+              <w:rPr>
+                <w:b/>
+                <w:bCs/>
+                <w:color w:val="FFFFFF"/>
+                <w:sz w:val="20"/>
+                <w:szCs w:val="20"/>
+              </w:rPr>
+              <w:t>«DayDate»</w:t>
+            </w:r>
+            <w:r>
+              <w:rPr>
+                <w:b/>
+                <w:bCs/>
+                <w:color w:val="FFFFFF"/>
+                <w:sz w:val="20"/>
+                <w:szCs w:val="20"/>
+              </w:rPr>
+              <w:fldChar w:fldCharType="end"/>
+            </w:r>
             <w:r>
               <w:t xml:space="preserve">　</w:t>
             </w:r>
-            <w:fldSimple w:instr=" MERGEFIELD DayWeekday ">
-              <w:r>
-                <w:rPr>
-                  <w:color w:val="C7D6DC"/>
-                  <w:sz w:val="18"/>
-                  <w:szCs w:val="18"/>
-                </w:rPr>
-                <w:t>«DayWeekday»</w:t>
-              </w:r>
-            </w:fldSimple>
+            <w:r>
+              <w:fldChar w:fldCharType="begin"/>
+            </w:r>
+            <w:r>
+              <w:instrText xml:space="preserve"> MERGEFIELD DayWeekday </w:instrText>
+            </w:r>
+            <w:r>
+              <w:fldChar w:fldCharType="separate"/>
+            </w:r>
+            <w:r>
+              <w:rPr>
+                <w:color w:val="C7D6DC"/>
+                <w:sz w:val="18"/>
+                <w:szCs w:val="18"/>
+              </w:rPr>
+              <w:t>«DayWeekday»</w:t>
+            </w:r>
+            <w:r>
+              <w:rPr>
+                <w:color w:val="C7D6DC"/>
+                <w:sz w:val="18"/>
+                <w:szCs w:val="18"/>
+              </w:rPr>
+              <w:fldChar w:fldCharType="end"/>
+            </w:r>
           </w:p>
         </w:tc>
         <w:tc>
@@ -281,18 +379,35 @@
               <w:spacing w:before="40"/>
               <w:jc w:val="right"/>
             </w:pPr>
-            <w:fldSimple w:instr=" MERGEFIELD DepartureTime ">
-              <w:r>
-                <w:rPr>
-                  <w:b/>
-                  <w:bCs/>
-                  <w:color w:val="C9973A"/>
-                  <w:sz w:val="24"/>
-                  <w:szCs w:val="24"/>
-                </w:rPr>
-                <w:t>«DepartureTime»</w:t>
-              </w:r>
-            </w:fldSimple>
+            <w:r>
+              <w:fldChar w:fldCharType="begin"/>
+            </w:r>
+            <w:r>
+              <w:instrText xml:space="preserve"> MERGEFIELD DepartureTime </w:instrText>
+            </w:r>
+            <w:r>
+              <w:fldChar w:fldCharType="separate"/>
+            </w:r>
+            <w:r>
+              <w:rPr>
+                <w:b/>
+                <w:bCs/>
+                <w:color w:val="C9973A"/>
+                <w:sz w:val="24"/>
+                <w:szCs w:val="24"/>
+              </w:rPr>
+              <w:t>«DepartureTime»</w:t>
+            </w:r>
+            <w:r>
+              <w:rPr>
+                <w:b/>
+                <w:bCs/>
+                <w:color w:val="C9973A"/>
+                <w:sz w:val="24"/>
+                <w:szCs w:val="24"/>
+              </w:rPr>
+              <w:fldChar w:fldCharType="end"/>
+            </w:r>
           </w:p>
         </w:tc>
       </w:tr>
@@ -334,9 +449,9 @@
               <w:tblLook w:val="0000" w:firstRow="0" w:lastRow="0" w:firstColumn="0" w:lastColumn="0" w:noHBand="0" w:noVBand="0"/>
             </w:tblPr>
             <w:tblGrid>
-              <w:gridCol w:w="1360"/>
-              <w:gridCol w:w="356"/>
-              <w:gridCol w:w="4380"/>
+              <w:gridCol w:w="1480"/>
+              <w:gridCol w:w="300"/>
+              <w:gridCol w:w="4316"/>
             </w:tblGrid>
             <w:tr>
               <w:trPr>
@@ -344,7 +459,7 @@
               </w:trPr>
               <w:tc>
                 <w:tcPr>
-                  <w:tcW w:w="900" w:type="pct"/>
+                  <w:tcW w:w="1270" w:type="pct"/>
                   <w:tcMar>
                     <w:top w:w="120" w:type="dxa"/>
                     <w:left w:w="100" w:type="dxa"/>
@@ -352,6 +467,7 @@
                     <w:right w:w="100" w:type="dxa"/>
                   </w:tcMar>
                 </w:tcPr>
+                <w:bookmarkStart w:id="1" w:name="_GoBack" w:colFirst="0" w:colLast="0"/>
                 <w:p>
                   <w:r>
                     <w:fldChar w:fldCharType="begin"/>
@@ -383,23 +499,40 @@
                   <w:pPr>
                     <w:jc w:val="right"/>
                   </w:pPr>
-                  <w:fldSimple w:instr=" MERGEFIELD StopTime ">
-                    <w:r>
-                      <w:rPr>
-                        <w:b/>
-                        <w:bCs/>
-                        <w:color w:val="1B3A4B"/>
-                        <w:sz w:val="20"/>
-                        <w:szCs w:val="20"/>
-                      </w:rPr>
-                      <w:t>«StopTime»</w:t>
-                    </w:r>
-                  </w:fldSimple>
+                  <w:r>
+                    <w:fldChar w:fldCharType="begin"/>
+                  </w:r>
+                  <w:r>
+                    <w:instrText xml:space="preserve"> MERGEFIELD StopTime </w:instrText>
+                  </w:r>
+                  <w:r>
+                    <w:fldChar w:fldCharType="separate"/>
+                  </w:r>
+                  <w:r>
+                    <w:rPr>
+                      <w:b/>
+                      <w:bCs/>
+                      <w:color w:val="1B3A4B"/>
+                      <w:sz w:val="20"/>
+                      <w:szCs w:val="20"/>
+                    </w:rPr>
+                    <w:t>«StopTime»</w:t>
+                  </w:r>
+                  <w:r>
+                    <w:rPr>
+                      <w:b/>
+                      <w:bCs/>
+                      <w:color w:val="1B3A4B"/>
+                      <w:sz w:val="20"/>
+                      <w:szCs w:val="20"/>
+                    </w:rPr>
+                    <w:fldChar w:fldCharType="end"/>
+                  </w:r>
                 </w:p>
               </w:tc>
               <w:tc>
                 <w:tcPr>
-                  <w:tcW w:w="400" w:type="pct"/>
+                  <w:tcW w:w="135" w:type="pct"/>
                   <w:tcBorders>
                     <w:left w:val="single" w:sz="14" w:space="0" w:color="C9973A"/>
                   </w:tcBorders>
@@ -425,7 +558,7 @@
               </w:tc>
               <w:tc>
                 <w:tcPr>
-                  <w:tcW w:w="3700" w:type="pct"/>
+                  <w:tcW w:w="3595" w:type="pct"/>
                   <w:tcMar>
                     <w:top w:w="120" w:type="dxa"/>
                     <w:left w:w="160" w:type="dxa"/>
@@ -434,18 +567,35 @@
                   </w:tcMar>
                 </w:tcPr>
                 <w:p>
-                  <w:fldSimple w:instr=" MERGEFIELD StopName ">
-                    <w:r>
-                      <w:rPr>
-                        <w:b/>
-                        <w:bCs/>
-                        <w:color w:val="222222"/>
-                        <w:sz w:val="22"/>
-                        <w:szCs w:val="22"/>
-                      </w:rPr>
-                      <w:t>«StopName»</w:t>
-                    </w:r>
-                  </w:fldSimple>
+                  <w:r>
+                    <w:fldChar w:fldCharType="begin"/>
+                  </w:r>
+                  <w:r>
+                    <w:instrText xml:space="preserve"> MERGEFIELD StopName </w:instrText>
+                  </w:r>
+                  <w:r>
+                    <w:fldChar w:fldCharType="separate"/>
+                  </w:r>
+                  <w:r>
+                    <w:rPr>
+                      <w:b/>
+                      <w:bCs/>
+                      <w:color w:val="222222"/>
+                      <w:sz w:val="22"/>
+                      <w:szCs w:val="22"/>
+                    </w:rPr>
+                    <w:t>«StopName»</w:t>
+                  </w:r>
+                  <w:r>
+                    <w:rPr>
+                      <w:b/>
+                      <w:bCs/>
+                      <w:color w:val="222222"/>
+                      <w:sz w:val="22"/>
+                      <w:szCs w:val="22"/>
+                    </w:rPr>
+                    <w:fldChar w:fldCharType="end"/>
+                  </w:r>
                 </w:p>
                 <w:p>
                   <w:pPr>
@@ -459,16 +609,31 @@
                     </w:rPr>
                     <w:t xml:space="preserve">停留 </w:t>
                   </w:r>
-                  <w:fldSimple w:instr=" MERGEFIELD StopDuration ">
-                    <w:r>
-                      <w:rPr>
-                        <w:color w:val="8A8A8A"/>
-                        <w:sz w:val="18"/>
-                        <w:szCs w:val="18"/>
-                      </w:rPr>
-                      <w:t>«StopDuration»</w:t>
-                    </w:r>
-                  </w:fldSimple>
+                  <w:r>
+                    <w:fldChar w:fldCharType="begin"/>
+                  </w:r>
+                  <w:r>
+                    <w:instrText xml:space="preserve"> MERGEFIELD StopDuration </w:instrText>
+                  </w:r>
+                  <w:r>
+                    <w:fldChar w:fldCharType="separate"/>
+                  </w:r>
+                  <w:r>
+                    <w:rPr>
+                      <w:color w:val="8A8A8A"/>
+                      <w:sz w:val="18"/>
+                      <w:szCs w:val="18"/>
+                    </w:rPr>
+                    <w:t>«StopDuration»</w:t>
+                  </w:r>
+                  <w:r>
+                    <w:rPr>
+                      <w:color w:val="8A8A8A"/>
+                      <w:sz w:val="18"/>
+                      <w:szCs w:val="18"/>
+                    </w:rPr>
+                    <w:fldChar w:fldCharType="end"/>
+                  </w:r>
                   <w:r>
                     <w:rPr>
                       <w:rFonts w:hint="eastAsia"/>
@@ -493,18 +658,35 @@
                     </w:rPr>
                     <w:t xml:space="preserve">移動時間　</w:t>
                   </w:r>
-                  <w:fldSimple w:instr=" MERGEFIELD TravelTimeToNext ">
-                    <w:r>
-                      <w:rPr>
-                        <w:i/>
-                        <w:iCs/>
-                        <w:color w:val="B7B7B7"/>
-                        <w:sz w:val="16"/>
-                        <w:szCs w:val="16"/>
-                      </w:rPr>
-                      <w:t>«TravelTimeToNext»</w:t>
-                    </w:r>
-                  </w:fldSimple>
+                  <w:r>
+                    <w:fldChar w:fldCharType="begin"/>
+                  </w:r>
+                  <w:r>
+                    <w:instrText xml:space="preserve"> MERGEFIELD TravelTimeToNext </w:instrText>
+                  </w:r>
+                  <w:r>
+                    <w:fldChar w:fldCharType="separate"/>
+                  </w:r>
+                  <w:r>
+                    <w:rPr>
+                      <w:i/>
+                      <w:iCs/>
+                      <w:color w:val="B7B7B7"/>
+                      <w:sz w:val="16"/>
+                      <w:szCs w:val="16"/>
+                    </w:rPr>
+                    <w:t>«TravelTimeToNext»</w:t>
+                  </w:r>
+                  <w:r>
+                    <w:rPr>
+                      <w:i/>
+                      <w:iCs/>
+                      <w:color w:val="B7B7B7"/>
+                      <w:sz w:val="16"/>
+                      <w:szCs w:val="16"/>
+                    </w:rPr>
+                    <w:fldChar w:fldCharType="end"/>
+                  </w:r>
                   <w:r>
                     <w:rPr>
                       <w:rFonts w:hint="eastAsia"/>
@@ -518,19 +700,35 @@
                   </w:r>
                 </w:p>
                 <w:p>
-                  <w:fldSimple w:instr=" MERGEFIELD TableEnd:Stops ">
-                    <w:r>
-                      <w:rPr>
-                        <w:color w:val="FFFFFF"/>
-                        <w:sz w:val="2"/>
-                        <w:szCs w:val="2"/>
-                      </w:rPr>
-                      <w:t>«TableEnd:Stops»</w:t>
-                    </w:r>
-                  </w:fldSimple>
+                  <w:r>
+                    <w:fldChar w:fldCharType="begin"/>
+                  </w:r>
+                  <w:r>
+                    <w:instrText xml:space="preserve"> MERGEFIELD TableEnd:Stops </w:instrText>
+                  </w:r>
+                  <w:r>
+                    <w:fldChar w:fldCharType="separate"/>
+                  </w:r>
+                  <w:r>
+                    <w:rPr>
+                      <w:color w:val="FFFFFF"/>
+                      <w:sz w:val="2"/>
+                      <w:szCs w:val="2"/>
+                    </w:rPr>
+                    <w:t>«TableEnd:Stops»</w:t>
+                  </w:r>
+                  <w:r>
+                    <w:rPr>
+                      <w:color w:val="FFFFFF"/>
+                      <w:sz w:val="2"/>
+                      <w:szCs w:val="2"/>
+                    </w:rPr>
+                    <w:fldChar w:fldCharType="end"/>
+                  </w:r>
                 </w:p>
               </w:tc>
             </w:tr>
+            <w:bookmarkEnd w:id="1"/>
           </w:tbl>
           <w:p/>
         </w:tc>
@@ -543,37 +741,18 @@
             </w:tcMar>
           </w:tcPr>
           <w:p>
-            <w:r>
-              <w:fldChar w:fldCharType="begin"/>
-            </w:r>
-            <w:r>
-              <w:instrText xml:space="preserve"> MERGEFIELD Image:DayRouteMap </w:instrText>
-            </w:r>
-            <w:r>
-              <w:fldChar w:fldCharType="separate"/>
-            </w:r>
-            <w:r>
-              <w:rPr>
-                <w:i/>
-                <w:iCs/>
-                <w:color w:val="B5B5B5"/>
-                <w:sz w:val="16"/>
-                <w:szCs w:val="16"/>
-              </w:rPr>
-              <w:t>«Image:DayRouteMap»</w:t>
-            </w:r>
-            <w:r>
-              <w:rPr>
-                <w:i/>
-                <w:iCs/>
-                <w:color w:val="B5B5B5"/>
-                <w:sz w:val="16"/>
-                <w:szCs w:val="16"/>
-              </w:rPr>
-              <w:fldChar w:fldCharType="end"/>
-            </w:r>
-            <w:bookmarkStart w:id="1" w:name="_GoBack"/>
-            <w:bookmarkEnd w:id="1"/>
+            <w:fldSimple w:instr=" MERGEFIELD Image:DayRouteMap ">
+              <w:r>
+                <w:rPr>
+                  <w:i/>
+                  <w:iCs/>
+                  <w:color w:val="B5B5B5"/>
+                  <w:sz w:val="16"/>
+                  <w:szCs w:val="16"/>
+                </w:rPr>
+                <w:t>«Image:DayRouteMap»</w:t>
+              </w:r>
+            </w:fldSimple>
           </w:p>
         </w:tc>
       </w:tr>
@@ -587,16 +766,31 @@
       </w:pPr>
     </w:p>
     <w:p>
-      <w:fldSimple w:instr=" MERGEFIELD TableEnd:Days ">
-        <w:r>
-          <w:rPr>
-            <w:color w:val="FFFFFF"/>
-            <w:sz w:val="2"/>
-            <w:szCs w:val="2"/>
-          </w:rPr>
-          <w:t>«TableEnd:Days»</w:t>
-        </w:r>
-      </w:fldSimple>
+      <w:r>
+        <w:fldChar w:fldCharType="begin"/>
+      </w:r>
+      <w:r>
+        <w:instrText xml:space="preserve"> MERGEFIELD TableEnd:Days </w:instrText>
+      </w:r>
+      <w:r>
+        <w:fldChar w:fldCharType="separate"/>
+      </w:r>
+      <w:r>
+        <w:rPr>
+          <w:color w:val="FFFFFF"/>
+          <w:sz w:val="2"/>
+          <w:szCs w:val="2"/>
+        </w:rPr>
+        <w:t>«TableEnd:Days»</w:t>
+      </w:r>
+      <w:r>
+        <w:rPr>
+          <w:color w:val="FFFFFF"/>
+          <w:sz w:val="2"/>
+          <w:szCs w:val="2"/>
+        </w:rPr>
+        <w:fldChar w:fldCharType="end"/>
+      </w:r>
     </w:p>
     <w:p>
       <w:r>

</xml_diff>